<commit_message>
Update AquiferOpenBibleDictionary data for 2026-09-18
</commit_message>
<xml_diff>
--- a/eng/docx/014.content.docx
+++ b/eng/docx/014.content.docx
@@ -20511,7 +20511,19 @@
         <w:rPr>
           <w:lang w:val="en_US" w:bidi="en_US"/>
         </w:rPr>
-        <w:t>1 John 3:11, 23</w:t>
+        <w:t>1 John 3:11</w:t>
+      </w:r>
+      <w:r>
+        <w:rPr>
+          <w:lang w:val="en_US" w:bidi="en_US"/>
+        </w:rPr>
+        <w:t xml:space="preserve">, </w:t>
+      </w:r>
+      <w:r>
+        <w:rPr>
+          <w:lang w:val="en_US" w:bidi="en_US"/>
+        </w:rPr>
+        <w:t>23</w:t>
       </w:r>
       <w:r>
         <w:rPr>
@@ -20523,7 +20535,19 @@
         <w:rPr>
           <w:lang w:val="en_US" w:bidi="en_US"/>
         </w:rPr>
-        <w:t>4:7, 11–12</w:t>
+        <w:t>4:7</w:t>
+      </w:r>
+      <w:r>
+        <w:rPr>
+          <w:lang w:val="en_US" w:bidi="en_US"/>
+        </w:rPr>
+        <w:t xml:space="preserve">, </w:t>
+      </w:r>
+      <w:r>
+        <w:rPr>
+          <w:lang w:val="en_US" w:bidi="en_US"/>
+        </w:rPr>
+        <w:t>11–12</w:t>
       </w:r>
       <w:r>
         <w:rPr>
@@ -20680,7 +20704,19 @@
         <w:rPr>
           <w:lang w:val="en_US" w:bidi="en_US"/>
         </w:rPr>
-        <w:t>Leviticus 19:18, 34</w:t>
+        <w:t>Leviticus 19:18</w:t>
+      </w:r>
+      <w:r>
+        <w:rPr>
+          <w:lang w:val="en_US" w:bidi="en_US"/>
+        </w:rPr>
+        <w:t xml:space="preserve">, </w:t>
+      </w:r>
+      <w:r>
+        <w:rPr>
+          <w:lang w:val="en_US" w:bidi="en_US"/>
+        </w:rPr>
+        <w:t>34</w:t>
       </w:r>
       <w:r>
         <w:rPr>

</xml_diff>